<commit_message>
docx with ai audit
</commit_message>
<xml_diff>
--- a/results/reports/QM2023_Capstone_Project_Summary.docx
+++ b/results/reports/QM2023_Capstone_Project_Summary.docx
@@ -6689,6 +6689,717 @@
           <w:szCs w:val="22"/>
         </w:rPr>
         <w:t xml:space="preserve">If the user story is a weather hedge, the model says the hedge is weak. If the user story is a crude-oil hedge, the model says that is where the signal lives. That distinction is the practical takeaway from the entire report.</w:t>
+      </w:r>
+    </w:p>
+    <w:p>
+      <w:r>
+        <w:br w:type="page"/>
+      </w:r>
+    </w:p>
+    <w:p>
+      <w:pPr>
+        <w:pStyle w:val="Heading1"/>
+        <w:spacing w:after="120" w:before="240"/>
+      </w:pPr>
+      <w:r>
+        <w:rPr>
+          <w:rFonts w:ascii="Arial" w:cs="Arial" w:eastAsia="Arial" w:hAnsi="Arial"/>
+          <w:b/>
+          <w:bCs/>
+          <w:i w:val="false"/>
+          <w:iCs w:val="false"/>
+          <w:caps w:val="false"/>
+          <w:color w:val="16324F"/>
+          <w:sz w:val="30"/>
+          <w:szCs w:val="30"/>
+        </w:rPr>
+        <w:t xml:space="preserve">AI Audit Appendix</w:t>
+      </w:r>
+    </w:p>
+    <w:p>
+      <w:pPr>
+        <w:spacing w:after="120" w:before="0"/>
+        <w:jc w:val="both"/>
+      </w:pPr>
+      <w:r>
+        <w:rPr>
+          <w:rFonts w:ascii="Arial" w:cs="Arial" w:eastAsia="Arial" w:hAnsi="Arial"/>
+          <w:b w:val="false"/>
+          <w:bCs w:val="false"/>
+          <w:i w:val="false"/>
+          <w:iCs w:val="false"/>
+          <w:caps w:val="false"/>
+          <w:color w:val="1F2937"/>
+          <w:sz w:val="22"/>
+          <w:szCs w:val="22"/>
+        </w:rPr>
+        <w:t xml:space="preserve">This appendix records how Claude via Claude Code CLI was used across the project. All AI outputs were treated as drafts, checked against computed results or primary documentation, and revised by the team before inclusion in the submission. The appendix is included at the end of the report so the main narrative remains focused on the empirical argument while the audit remains visible and transparent.</w:t>
+      </w:r>
+    </w:p>
+    <w:p>
+      <w:pPr>
+        <w:pStyle w:val="Heading2"/>
+        <w:spacing w:after="120" w:before="180"/>
+      </w:pPr>
+      <w:r>
+        <w:rPr>
+          <w:rFonts w:ascii="Arial" w:cs="Arial" w:eastAsia="Arial" w:hAnsi="Arial"/>
+          <w:b/>
+          <w:bCs/>
+          <w:i w:val="false"/>
+          <w:iCs w:val="false"/>
+          <w:caps w:val="false"/>
+          <w:color w:val="1F3B57"/>
+          <w:sz w:val="24"/>
+          <w:szCs w:val="24"/>
+        </w:rPr>
+        <w:t xml:space="preserve">Milestone Summary</w:t>
+      </w:r>
+    </w:p>
+    <w:tbl>
+      <w:tblPr>
+        <w:tblW w:type="dxa" w:w="9360"/>
+        <w:tblBorders>
+          <w:top w:val="single" w:color="auto" w:sz="4"/>
+          <w:left w:val="single" w:color="auto" w:sz="4"/>
+          <w:bottom w:val="single" w:color="auto" w:sz="4"/>
+          <w:right w:val="single" w:color="auto" w:sz="4"/>
+          <w:insideH w:val="single" w:color="auto" w:sz="4"/>
+          <w:insideV w:val="single" w:color="auto" w:sz="4"/>
+        </w:tblBorders>
+      </w:tblPr>
+      <w:tblGrid>
+        <w:gridCol w:w="1500"/>
+        <w:gridCol w:w="3700"/>
+        <w:gridCol w:w="4160"/>
+      </w:tblGrid>
+      <w:tr>
+        <w:tc>
+          <w:tcPr>
+            <w:tcW w:type="dxa" w:w="1500"/>
+            <w:tcBorders>
+              <w:top w:val="single" w:color="C9D4E1" w:sz="1"/>
+              <w:left w:val="single" w:color="C9D4E1" w:sz="1"/>
+              <w:bottom w:val="single" w:color="C9D4E1" w:sz="1"/>
+              <w:right w:val="single" w:color="C9D4E1" w:sz="1"/>
+            </w:tcBorders>
+            <w:shd w:fill="1F3B57" w:val="clear"/>
+            <w:tcMar>
+              <w:top w:type="dxa" w:w="100"/>
+              <w:left w:type="dxa" w:w="120"/>
+              <w:bottom w:type="dxa" w:w="100"/>
+              <w:right w:type="dxa" w:w="120"/>
+            </w:tcMar>
+          </w:tcPr>
+          <w:p>
+            <w:pPr>
+              <w:spacing w:after="0" w:before="0"/>
+              <w:jc w:val="left"/>
+            </w:pPr>
+            <w:r>
+              <w:rPr>
+                <w:rFonts w:ascii="Arial" w:cs="Arial" w:eastAsia="Arial" w:hAnsi="Arial"/>
+                <w:b/>
+                <w:bCs/>
+                <w:i w:val="false"/>
+                <w:iCs w:val="false"/>
+                <w:caps w:val="false"/>
+                <w:color w:val="FFFFFF"/>
+                <w:sz w:val="20"/>
+                <w:szCs w:val="20"/>
+              </w:rPr>
+              <w:t xml:space="preserve">Milestone</w:t>
+            </w:r>
+          </w:p>
+        </w:tc>
+        <w:tc>
+          <w:tcPr>
+            <w:tcW w:type="dxa" w:w="3700"/>
+            <w:tcBorders>
+              <w:top w:val="single" w:color="C9D4E1" w:sz="1"/>
+              <w:left w:val="single" w:color="C9D4E1" w:sz="1"/>
+              <w:bottom w:val="single" w:color="C9D4E1" w:sz="1"/>
+              <w:right w:val="single" w:color="C9D4E1" w:sz="1"/>
+            </w:tcBorders>
+            <w:shd w:fill="1F3B57" w:val="clear"/>
+            <w:tcMar>
+              <w:top w:type="dxa" w:w="100"/>
+              <w:left w:type="dxa" w:w="120"/>
+              <w:bottom w:type="dxa" w:w="100"/>
+              <w:right w:type="dxa" w:w="120"/>
+            </w:tcMar>
+          </w:tcPr>
+          <w:p>
+            <w:pPr>
+              <w:spacing w:after="0" w:before="0"/>
+              <w:jc w:val="left"/>
+            </w:pPr>
+            <w:r>
+              <w:rPr>
+                <w:rFonts w:ascii="Arial" w:cs="Arial" w:eastAsia="Arial" w:hAnsi="Arial"/>
+                <w:b/>
+                <w:bCs/>
+                <w:i w:val="false"/>
+                <w:iCs w:val="false"/>
+                <w:caps w:val="false"/>
+                <w:color w:val="FFFFFF"/>
+                <w:sz w:val="20"/>
+                <w:szCs w:val="20"/>
+              </w:rPr>
+              <w:t xml:space="preserve">AI-assisted tasks</w:t>
+            </w:r>
+          </w:p>
+        </w:tc>
+        <w:tc>
+          <w:tcPr>
+            <w:tcW w:type="dxa" w:w="4160"/>
+            <w:tcBorders>
+              <w:top w:val="single" w:color="C9D4E1" w:sz="1"/>
+              <w:left w:val="single" w:color="C9D4E1" w:sz="1"/>
+              <w:bottom w:val="single" w:color="C9D4E1" w:sz="1"/>
+              <w:right w:val="single" w:color="C9D4E1" w:sz="1"/>
+            </w:tcBorders>
+            <w:shd w:fill="1F3B57" w:val="clear"/>
+            <w:tcMar>
+              <w:top w:type="dxa" w:w="100"/>
+              <w:left w:type="dxa" w:w="120"/>
+              <w:bottom w:type="dxa" w:w="100"/>
+              <w:right w:type="dxa" w:w="120"/>
+            </w:tcMar>
+          </w:tcPr>
+          <w:p>
+            <w:pPr>
+              <w:spacing w:after="0" w:before="0"/>
+              <w:jc w:val="left"/>
+            </w:pPr>
+            <w:r>
+              <w:rPr>
+                <w:rFonts w:ascii="Arial" w:cs="Arial" w:eastAsia="Arial" w:hAnsi="Arial"/>
+                <w:b/>
+                <w:bCs/>
+                <w:i w:val="false"/>
+                <w:iCs w:val="false"/>
+                <w:caps w:val="false"/>
+                <w:color w:val="FFFFFF"/>
+                <w:sz w:val="20"/>
+                <w:szCs w:val="20"/>
+              </w:rPr>
+              <w:t xml:space="preserve">Key human corrections</w:t>
+            </w:r>
+          </w:p>
+        </w:tc>
+      </w:tr>
+      <w:tr>
+        <w:tc>
+          <w:tcPr>
+            <w:tcW w:type="dxa" w:w="1500"/>
+            <w:tcBorders>
+              <w:top w:val="single" w:color="C9D4E1" w:sz="1"/>
+              <w:left w:val="single" w:color="C9D4E1" w:sz="1"/>
+              <w:bottom w:val="single" w:color="C9D4E1" w:sz="1"/>
+              <w:right w:val="single" w:color="C9D4E1" w:sz="1"/>
+            </w:tcBorders>
+            <w:tcMar>
+              <w:top w:type="dxa" w:w="100"/>
+              <w:left w:type="dxa" w:w="120"/>
+              <w:bottom w:type="dxa" w:w="100"/>
+              <w:right w:type="dxa" w:w="120"/>
+            </w:tcMar>
+          </w:tcPr>
+          <w:p>
+            <w:pPr>
+              <w:spacing w:after="0" w:before="0"/>
+              <w:jc w:val="left"/>
+            </w:pPr>
+            <w:r>
+              <w:rPr>
+                <w:rFonts w:ascii="Arial" w:cs="Arial" w:eastAsia="Arial" w:hAnsi="Arial"/>
+                <w:b/>
+                <w:bCs/>
+                <w:i w:val="false"/>
+                <w:iCs w:val="false"/>
+                <w:caps w:val="false"/>
+                <w:color w:val="1F2937"/>
+                <w:sz w:val="20"/>
+                <w:szCs w:val="20"/>
+              </w:rPr>
+              <w:t xml:space="preserve">M1</w:t>
+            </w:r>
+          </w:p>
+        </w:tc>
+        <w:tc>
+          <w:tcPr>
+            <w:tcW w:type="dxa" w:w="3700"/>
+            <w:tcBorders>
+              <w:top w:val="single" w:color="C9D4E1" w:sz="1"/>
+              <w:left w:val="single" w:color="C9D4E1" w:sz="1"/>
+              <w:bottom w:val="single" w:color="C9D4E1" w:sz="1"/>
+              <w:right w:val="single" w:color="C9D4E1" w:sz="1"/>
+            </w:tcBorders>
+            <w:tcMar>
+              <w:top w:type="dxa" w:w="100"/>
+              <w:left w:type="dxa" w:w="120"/>
+              <w:bottom w:type="dxa" w:w="100"/>
+              <w:right w:type="dxa" w:w="120"/>
+            </w:tcMar>
+          </w:tcPr>
+          <w:p>
+            <w:pPr>
+              <w:spacing w:after="0" w:before="0"/>
+              <w:jc w:val="left"/>
+            </w:pPr>
+            <w:r>
+              <w:rPr>
+                <w:rFonts w:ascii="Arial" w:cs="Arial" w:eastAsia="Arial" w:hAnsi="Arial"/>
+                <w:b w:val="false"/>
+                <w:bCs w:val="false"/>
+                <w:i w:val="false"/>
+                <w:iCs w:val="false"/>
+                <w:caps w:val="false"/>
+                <w:color w:val="1F2937"/>
+                <w:sz w:val="20"/>
+                <w:szCs w:val="20"/>
+              </w:rPr>
+              <w:t xml:space="preserve">FRED data fetch, NOAA pagination, merge strategy</w:t>
+            </w:r>
+          </w:p>
+        </w:tc>
+        <w:tc>
+          <w:tcPr>
+            <w:tcW w:type="dxa" w:w="4160"/>
+            <w:tcBorders>
+              <w:top w:val="single" w:color="C9D4E1" w:sz="1"/>
+              <w:left w:val="single" w:color="C9D4E1" w:sz="1"/>
+              <w:bottom w:val="single" w:color="C9D4E1" w:sz="1"/>
+              <w:right w:val="single" w:color="C9D4E1" w:sz="1"/>
+            </w:tcBorders>
+            <w:tcMar>
+              <w:top w:type="dxa" w:w="100"/>
+              <w:left w:type="dxa" w:w="120"/>
+              <w:bottom w:type="dxa" w:w="100"/>
+              <w:right w:type="dxa" w:w="120"/>
+            </w:tcMar>
+          </w:tcPr>
+          <w:p>
+            <w:pPr>
+              <w:spacing w:after="0" w:before="0"/>
+              <w:jc w:val="left"/>
+            </w:pPr>
+            <w:r>
+              <w:rPr>
+                <w:rFonts w:ascii="Arial" w:cs="Arial" w:eastAsia="Arial" w:hAnsi="Arial"/>
+                <w:b w:val="false"/>
+                <w:bCs w:val="false"/>
+                <w:i w:val="false"/>
+                <w:iCs w:val="false"/>
+                <w:caps w:val="false"/>
+                <w:color w:val="1F2937"/>
+                <w:sz w:val="20"/>
+                <w:szCs w:val="20"/>
+              </w:rPr>
+              <w:t xml:space="preserve">Added retry handling, units=standard, and row-count assertions.</w:t>
+            </w:r>
+          </w:p>
+        </w:tc>
+      </w:tr>
+      <w:tr>
+        <w:tc>
+          <w:tcPr>
+            <w:tcW w:type="dxa" w:w="1500"/>
+            <w:tcBorders>
+              <w:top w:val="single" w:color="C9D4E1" w:sz="1"/>
+              <w:left w:val="single" w:color="C9D4E1" w:sz="1"/>
+              <w:bottom w:val="single" w:color="C9D4E1" w:sz="1"/>
+              <w:right w:val="single" w:color="C9D4E1" w:sz="1"/>
+            </w:tcBorders>
+            <w:tcMar>
+              <w:top w:type="dxa" w:w="100"/>
+              <w:left w:type="dxa" w:w="120"/>
+              <w:bottom w:type="dxa" w:w="100"/>
+              <w:right w:type="dxa" w:w="120"/>
+            </w:tcMar>
+          </w:tcPr>
+          <w:p>
+            <w:pPr>
+              <w:spacing w:after="0" w:before="0"/>
+              <w:jc w:val="left"/>
+            </w:pPr>
+            <w:r>
+              <w:rPr>
+                <w:rFonts w:ascii="Arial" w:cs="Arial" w:eastAsia="Arial" w:hAnsi="Arial"/>
+                <w:b/>
+                <w:bCs/>
+                <w:i w:val="false"/>
+                <w:iCs w:val="false"/>
+                <w:caps w:val="false"/>
+                <w:color w:val="1F2937"/>
+                <w:sz w:val="20"/>
+                <w:szCs w:val="20"/>
+              </w:rPr>
+              <w:t xml:space="preserve">M2</w:t>
+            </w:r>
+          </w:p>
+        </w:tc>
+        <w:tc>
+          <w:tcPr>
+            <w:tcW w:type="dxa" w:w="3700"/>
+            <w:tcBorders>
+              <w:top w:val="single" w:color="C9D4E1" w:sz="1"/>
+              <w:left w:val="single" w:color="C9D4E1" w:sz="1"/>
+              <w:bottom w:val="single" w:color="C9D4E1" w:sz="1"/>
+              <w:right w:val="single" w:color="C9D4E1" w:sz="1"/>
+            </w:tcBorders>
+            <w:tcMar>
+              <w:top w:type="dxa" w:w="100"/>
+              <w:left w:type="dxa" w:w="120"/>
+              <w:bottom w:type="dxa" w:w="100"/>
+              <w:right w:type="dxa" w:w="120"/>
+            </w:tcMar>
+          </w:tcPr>
+          <w:p>
+            <w:pPr>
+              <w:spacing w:after="0" w:before="0"/>
+              <w:jc w:val="left"/>
+            </w:pPr>
+            <w:r>
+              <w:rPr>
+                <w:rFonts w:ascii="Arial" w:cs="Arial" w:eastAsia="Arial" w:hAnsi="Arial"/>
+                <w:b w:val="false"/>
+                <w:bCs w:val="false"/>
+                <w:i w:val="false"/>
+                <w:iCs w:val="false"/>
+                <w:caps w:val="false"/>
+                <w:color w:val="1F2937"/>
+                <w:sz w:val="20"/>
+                <w:szCs w:val="20"/>
+              </w:rPr>
+              <w:t xml:space="preserve">Path config, EDA notebook structure, EDA summary</w:t>
+            </w:r>
+          </w:p>
+        </w:tc>
+        <w:tc>
+          <w:tcPr>
+            <w:tcW w:type="dxa" w:w="4160"/>
+            <w:tcBorders>
+              <w:top w:val="single" w:color="C9D4E1" w:sz="1"/>
+              <w:left w:val="single" w:color="C9D4E1" w:sz="1"/>
+              <w:bottom w:val="single" w:color="C9D4E1" w:sz="1"/>
+              <w:right w:val="single" w:color="C9D4E1" w:sz="1"/>
+            </w:tcBorders>
+            <w:tcMar>
+              <w:top w:type="dxa" w:w="100"/>
+              <w:left w:type="dxa" w:w="120"/>
+              <w:bottom w:type="dxa" w:w="100"/>
+              <w:right w:type="dxa" w:w="120"/>
+            </w:tcMar>
+          </w:tcPr>
+          <w:p>
+            <w:pPr>
+              <w:spacing w:after="0" w:before="0"/>
+              <w:jc w:val="left"/>
+            </w:pPr>
+            <w:r>
+              <w:rPr>
+                <w:rFonts w:ascii="Arial" w:cs="Arial" w:eastAsia="Arial" w:hAnsi="Arial"/>
+                <w:b w:val="false"/>
+                <w:bCs w:val="false"/>
+                <w:i w:val="false"/>
+                <w:iCs w:val="false"/>
+                <w:caps w:val="false"/>
+                <w:color w:val="1F2937"/>
+                <w:sz w:val="20"/>
+                <w:szCs w:val="20"/>
+              </w:rPr>
+              <w:t xml:space="preserve">Changed the rolling window to 24 months, fixed axis units, and added the geographic mismatch flag.</w:t>
+            </w:r>
+          </w:p>
+        </w:tc>
+      </w:tr>
+      <w:tr>
+        <w:tc>
+          <w:tcPr>
+            <w:tcW w:type="dxa" w:w="1500"/>
+            <w:tcBorders>
+              <w:top w:val="single" w:color="C9D4E1" w:sz="1"/>
+              <w:left w:val="single" w:color="C9D4E1" w:sz="1"/>
+              <w:bottom w:val="single" w:color="C9D4E1" w:sz="1"/>
+              <w:right w:val="single" w:color="C9D4E1" w:sz="1"/>
+            </w:tcBorders>
+            <w:tcMar>
+              <w:top w:type="dxa" w:w="100"/>
+              <w:left w:type="dxa" w:w="120"/>
+              <w:bottom w:type="dxa" w:w="100"/>
+              <w:right w:type="dxa" w:w="120"/>
+            </w:tcMar>
+          </w:tcPr>
+          <w:p>
+            <w:pPr>
+              <w:spacing w:after="0" w:before="0"/>
+              <w:jc w:val="left"/>
+            </w:pPr>
+            <w:r>
+              <w:rPr>
+                <w:rFonts w:ascii="Arial" w:cs="Arial" w:eastAsia="Arial" w:hAnsi="Arial"/>
+                <w:b/>
+                <w:bCs/>
+                <w:i w:val="false"/>
+                <w:iCs w:val="false"/>
+                <w:caps w:val="false"/>
+                <w:color w:val="1F2937"/>
+                <w:sz w:val="20"/>
+                <w:szCs w:val="20"/>
+              </w:rPr>
+              <w:t xml:space="preserve">M3</w:t>
+            </w:r>
+          </w:p>
+        </w:tc>
+        <w:tc>
+          <w:tcPr>
+            <w:tcW w:type="dxa" w:w="3700"/>
+            <w:tcBorders>
+              <w:top w:val="single" w:color="C9D4E1" w:sz="1"/>
+              <w:left w:val="single" w:color="C9D4E1" w:sz="1"/>
+              <w:bottom w:val="single" w:color="C9D4E1" w:sz="1"/>
+              <w:right w:val="single" w:color="C9D4E1" w:sz="1"/>
+            </w:tcBorders>
+            <w:tcMar>
+              <w:top w:type="dxa" w:w="100"/>
+              <w:left w:type="dxa" w:w="120"/>
+              <w:bottom w:type="dxa" w:w="100"/>
+              <w:right w:type="dxa" w:w="120"/>
+            </w:tcMar>
+          </w:tcPr>
+          <w:p>
+            <w:pPr>
+              <w:spacing w:after="0" w:before="0"/>
+              <w:jc w:val="left"/>
+            </w:pPr>
+            <w:r>
+              <w:rPr>
+                <w:rFonts w:ascii="Arial" w:cs="Arial" w:eastAsia="Arial" w:hAnsi="Arial"/>
+                <w:b w:val="false"/>
+                <w:bCs w:val="false"/>
+                <w:i w:val="false"/>
+                <w:iCs w:val="false"/>
+                <w:caps w:val="false"/>
+                <w:color w:val="1F2937"/>
+                <w:sz w:val="20"/>
+                <w:szCs w:val="20"/>
+              </w:rPr>
+              <w:t xml:space="preserve">Model design, diagnostics, robustness checks, HAC SE</w:t>
+            </w:r>
+          </w:p>
+        </w:tc>
+        <w:tc>
+          <w:tcPr>
+            <w:tcW w:type="dxa" w:w="4160"/>
+            <w:tcBorders>
+              <w:top w:val="single" w:color="C9D4E1" w:sz="1"/>
+              <w:left w:val="single" w:color="C9D4E1" w:sz="1"/>
+              <w:bottom w:val="single" w:color="C9D4E1" w:sz="1"/>
+              <w:right w:val="single" w:color="C9D4E1" w:sz="1"/>
+            </w:tcBorders>
+            <w:tcMar>
+              <w:top w:type="dxa" w:w="100"/>
+              <w:left w:type="dxa" w:w="120"/>
+              <w:bottom w:type="dxa" w:w="100"/>
+              <w:right w:type="dxa" w:w="120"/>
+            </w:tcMar>
+          </w:tcPr>
+          <w:p>
+            <w:pPr>
+              <w:spacing w:after="0" w:before="0"/>
+              <w:jc w:val="left"/>
+            </w:pPr>
+            <w:r>
+              <w:rPr>
+                <w:rFonts w:ascii="Arial" w:cs="Arial" w:eastAsia="Arial" w:hAnsi="Arial"/>
+                <w:b w:val="false"/>
+                <w:bCs w:val="false"/>
+                <w:i w:val="false"/>
+                <w:iCs w:val="false"/>
+                <w:caps w:val="false"/>
+                <w:color w:val="1F2937"/>
+                <w:sz w:val="20"/>
+                <w:szCs w:val="20"/>
+              </w:rPr>
+              <w:t xml:space="preserve">Fixed the add-constant bug, added a fifth robustness check, and rejected an inappropriate placebo DiD suggestion.</w:t>
+            </w:r>
+          </w:p>
+        </w:tc>
+      </w:tr>
+      <w:tr>
+        <w:tc>
+          <w:tcPr>
+            <w:tcW w:type="dxa" w:w="1500"/>
+            <w:tcBorders>
+              <w:top w:val="single" w:color="C9D4E1" w:sz="1"/>
+              <w:left w:val="single" w:color="C9D4E1" w:sz="1"/>
+              <w:bottom w:val="single" w:color="C9D4E1" w:sz="1"/>
+              <w:right w:val="single" w:color="C9D4E1" w:sz="1"/>
+            </w:tcBorders>
+            <w:tcMar>
+              <w:top w:type="dxa" w:w="100"/>
+              <w:left w:type="dxa" w:w="120"/>
+              <w:bottom w:type="dxa" w:w="100"/>
+              <w:right w:type="dxa" w:w="120"/>
+            </w:tcMar>
+          </w:tcPr>
+          <w:p>
+            <w:pPr>
+              <w:spacing w:after="0" w:before="0"/>
+              <w:jc w:val="left"/>
+            </w:pPr>
+            <w:r>
+              <w:rPr>
+                <w:rFonts w:ascii="Arial" w:cs="Arial" w:eastAsia="Arial" w:hAnsi="Arial"/>
+                <w:b/>
+                <w:bCs/>
+                <w:i w:val="false"/>
+                <w:iCs w:val="false"/>
+                <w:caps w:val="false"/>
+                <w:color w:val="1F2937"/>
+                <w:sz w:val="20"/>
+                <w:szCs w:val="20"/>
+              </w:rPr>
+              <w:t xml:space="preserve">M4</w:t>
+            </w:r>
+          </w:p>
+        </w:tc>
+        <w:tc>
+          <w:tcPr>
+            <w:tcW w:type="dxa" w:w="3700"/>
+            <w:tcBorders>
+              <w:top w:val="single" w:color="C9D4E1" w:sz="1"/>
+              <w:left w:val="single" w:color="C9D4E1" w:sz="1"/>
+              <w:bottom w:val="single" w:color="C9D4E1" w:sz="1"/>
+              <w:right w:val="single" w:color="C9D4E1" w:sz="1"/>
+            </w:tcBorders>
+            <w:tcMar>
+              <w:top w:type="dxa" w:w="100"/>
+              <w:left w:type="dxa" w:w="120"/>
+              <w:bottom w:type="dxa" w:w="100"/>
+              <w:right w:type="dxa" w:w="120"/>
+            </w:tcMar>
+          </w:tcPr>
+          <w:p>
+            <w:pPr>
+              <w:spacing w:after="0" w:before="0"/>
+              <w:jc w:val="left"/>
+            </w:pPr>
+            <w:r>
+              <w:rPr>
+                <w:rFonts w:ascii="Arial" w:cs="Arial" w:eastAsia="Arial" w:hAnsi="Arial"/>
+                <w:b w:val="false"/>
+                <w:bCs w:val="false"/>
+                <w:i w:val="false"/>
+                <w:iCs w:val="false"/>
+                <w:caps w:val="false"/>
+                <w:color w:val="1F2937"/>
+                <w:sz w:val="20"/>
+                <w:szCs w:val="20"/>
+              </w:rPr>
+              <w:t xml:space="preserve">Investment memo structure, scenario analysis, addendums</w:t>
+            </w:r>
+          </w:p>
+        </w:tc>
+        <w:tc>
+          <w:tcPr>
+            <w:tcW w:type="dxa" w:w="4160"/>
+            <w:tcBorders>
+              <w:top w:val="single" w:color="C9D4E1" w:sz="1"/>
+              <w:left w:val="single" w:color="C9D4E1" w:sz="1"/>
+              <w:bottom w:val="single" w:color="C9D4E1" w:sz="1"/>
+              <w:right w:val="single" w:color="C9D4E1" w:sz="1"/>
+            </w:tcBorders>
+            <w:tcMar>
+              <w:top w:type="dxa" w:w="100"/>
+              <w:left w:type="dxa" w:w="120"/>
+              <w:bottom w:type="dxa" w:w="100"/>
+              <w:right w:type="dxa" w:w="120"/>
+            </w:tcMar>
+          </w:tcPr>
+          <w:p>
+            <w:pPr>
+              <w:spacing w:after="0" w:before="0"/>
+              <w:jc w:val="left"/>
+            </w:pPr>
+            <w:r>
+              <w:rPr>
+                <w:rFonts w:ascii="Arial" w:cs="Arial" w:eastAsia="Arial" w:hAnsi="Arial"/>
+                <w:b w:val="false"/>
+                <w:bCs w:val="false"/>
+                <w:i w:val="false"/>
+                <w:iCs w:val="false"/>
+                <w:caps w:val="false"/>
+                <w:color w:val="1F2937"/>
+                <w:sz w:val="20"/>
+                <w:szCs w:val="20"/>
+              </w:rPr>
+              <w:t xml:space="preserve">Removed jargon, added two scenarios, and rewrote the addendums to reference traceable contributions.</w:t>
+            </w:r>
+          </w:p>
+        </w:tc>
+      </w:tr>
+    </w:tbl>
+    <w:p>
+      <w:pPr>
+        <w:pStyle w:val="Heading2"/>
+        <w:spacing w:after="120" w:before="180"/>
+      </w:pPr>
+      <w:r>
+        <w:rPr>
+          <w:rFonts w:ascii="Arial" w:cs="Arial" w:eastAsia="Arial" w:hAnsi="Arial"/>
+          <w:b/>
+          <w:bCs/>
+          <w:i w:val="false"/>
+          <w:iCs w:val="false"/>
+          <w:caps w:val="false"/>
+          <w:color w:val="1F3B57"/>
+          <w:sz w:val="24"/>
+          <w:szCs w:val="24"/>
+        </w:rPr>
+        <w:t xml:space="preserve">Verification Standard</w:t>
+      </w:r>
+    </w:p>
+    <w:p>
+      <w:pPr>
+        <w:spacing w:after="120" w:before="0"/>
+        <w:jc w:val="both"/>
+      </w:pPr>
+      <w:r>
+        <w:rPr>
+          <w:rFonts w:ascii="Arial" w:cs="Arial" w:eastAsia="Arial" w:hAnsi="Arial"/>
+          <w:b w:val="false"/>
+          <w:bCs w:val="false"/>
+          <w:i w:val="false"/>
+          <w:iCs w:val="false"/>
+          <w:caps w:val="false"/>
+          <w:color w:val="1F2937"/>
+          <w:sz w:val="22"/>
+          <w:szCs w:val="22"/>
+        </w:rPr>
+        <w:t xml:space="preserve">The team used three checks before accepting any AI-generated material: a direct run of the code or notebook, comparison against source documentation or course materials, or a consistency check against the model output. That process caught every substantive issue in the record, including the NOAA units omission, the notebook window choice, the constant-term bug in the predictive model, and the need to frame the memo for a non-technical audience.</w:t>
+      </w:r>
+    </w:p>
+    <w:p>
+      <w:pPr>
+        <w:spacing w:after="120" w:before="0"/>
+        <w:jc w:val="both"/>
+      </w:pPr>
+      <w:r>
+        <w:rPr>
+          <w:rFonts w:ascii="Arial" w:cs="Arial" w:eastAsia="Arial" w:hAnsi="Arial"/>
+          <w:b w:val="false"/>
+          <w:bCs w:val="false"/>
+          <w:i w:val="false"/>
+          <w:iCs w:val="false"/>
+          <w:caps w:val="false"/>
+          <w:color w:val="1F2937"/>
+          <w:sz w:val="22"/>
+          <w:szCs w:val="22"/>
+        </w:rPr>
+        <w:t xml:space="preserve">The full milestone-by-milestone audit record is maintained in AI_AUDIT_APPENDIX.md in the repository. The version included here is a compact end-of-document summary designed for readers who want the audit available without interrupting the main report flow.</w:t>
       </w:r>
     </w:p>
     <w:p>

</xml_diff>